<commit_message>
Build data-driven VLA demo and LaTeX report
</commit_message>
<xml_diff>
--- a/report/自动驾驶VLA自进化研究报告.docx
+++ b/report/自动驾驶VLA自进化研究报告.docx
@@ -3917,7 +3917,7 @@
           <w:b w:val="0"/>
           <w:sz w:val="21"/>
         </w:rPr>
-        <w:t xml:space="preserve"> 可一键执行数据生成、轻量训练和评估；随后执行 </w:t>
+        <w:t xml:space="preserve"> 可一键执行数据构建、轻量训练和评估；随后执行 </w:t>
       </w:r>
       <w:r>
         <w:rPr>
@@ -3981,7 +3981,23 @@
           <w:b w:val="0"/>
           <w:sz w:val="21"/>
         </w:rPr>
-        <w:t>。新版网页由 Python 动态 API 驱动，不是离线静态页面：道路包含车道线、停止线、信号灯、前车、行人和天气效果；红色轨迹表示初始 Baseline，青色轨迹表示反思后策略；播放控件动态模拟 6 秒路径规划窗口。右侧同步展示 Safety、Rule、Comfort、Overall、三轮自进化历史、五阶段事件链和结构化 Reflection，并在顶部显示基座文件完整性及当前轨迹来源。</w:t>
+        <w:t xml:space="preserve">。新版网页由 Python 动态 API 驱动，不是离线静态页面：前端不保存固定场景、轨迹或分数，四类演示场景由后端从完整 5,000 条训练数据中动态匹配，也支持按 </w:t>
+      </w:r>
+      <w:r>
+        <w:rPr>
+          <w:rFonts w:ascii="Calibri" w:hAnsi="Calibri" w:eastAsia="等线"/>
+          <w:b/>
+          <w:sz w:val="19"/>
+        </w:rPr>
+        <w:t>scene_id</w:t>
+      </w:r>
+      <w:r>
+        <w:rPr>
+          <w:rFonts w:ascii="Calibri" w:hAnsi="Calibri" w:eastAsia="宋体"/>
+          <w:b w:val="0"/>
+          <w:sz w:val="21"/>
+        </w:rPr>
+        <w:t xml:space="preserve"> 和随机偏移加载。道路几何、停止线、信号灯、前车、行人、弯道和天气效果均由本次场景 JSON 驱动；红色轨迹表示初始 Baseline，青色轨迹表示反思后策略；播放控件动态模拟 6 秒路径规划窗口。</w:t>
       </w:r>
     </w:p>
     <w:p>
@@ -4088,7 +4104,7 @@
           <w:b w:val="0"/>
           <w:sz w:val="21"/>
         </w:rPr>
-        <w:t xml:space="preserve">页面可继续手工调整速度、距离、曲率、导航和天气。服务端新增 </w:t>
+        <w:t>页面可继续手工调整速度、距离、曲率、导航和天气；修改后使用新的场景 ID，避免误命中旧缓存。服务端使用当前策略实时规划，并以规则 Critic 65%、训练后的 Reward Critic 25%、完整训练集七近邻校准 10% 计算三维分数。</w:t>
       </w:r>
       <w:r>
         <w:rPr>
@@ -4096,7 +4112,7 @@
           <w:b/>
           <w:sz w:val="19"/>
         </w:rPr>
-        <w:t>/api/compare</w:t>
+        <w:t>/api/logs</w:t>
       </w:r>
       <w:r>
         <w:rPr>
@@ -4104,7 +4120,7 @@
           <w:b w:val="0"/>
           <w:sz w:val="21"/>
         </w:rPr>
-        <w:t xml:space="preserve"> 同场景双策略接口与 </w:t>
+        <w:t xml:space="preserve"> 持续输出数据文件加载、Reward Critic 参数连接、规划调用的实际 runtime 与耗时、评分近邻和 Reflection 结果；</w:t>
       </w:r>
       <w:r>
         <w:rPr>
@@ -4112,7 +4128,7 @@
           <w:b/>
           <w:sz w:val="19"/>
         </w:rPr>
-        <w:t>/api/meta</w:t>
+        <w:t>/api/data/status</w:t>
       </w:r>
       <w:r>
         <w:rPr>
@@ -4120,7 +4136,39 @@
           <w:b w:val="0"/>
           <w:sz w:val="21"/>
         </w:rPr>
-        <w:t xml:space="preserve"> 模型披露接口，仍只使用 Python 标准库，数值计算仅依赖 NumPy。完整操作、字段含义和故障排查见 </w:t>
+        <w:t>、</w:t>
+      </w:r>
+      <w:r>
+        <w:rPr>
+          <w:rFonts w:ascii="Calibri" w:hAnsi="Calibri" w:eastAsia="等线"/>
+          <w:b/>
+          <w:sz w:val="19"/>
+        </w:rPr>
+        <w:t>/api/scenarios</w:t>
+      </w:r>
+      <w:r>
+        <w:rPr>
+          <w:rFonts w:ascii="Calibri" w:hAnsi="Calibri" w:eastAsia="宋体"/>
+          <w:b w:val="0"/>
+          <w:sz w:val="21"/>
+        </w:rPr>
+        <w:t>、</w:t>
+      </w:r>
+      <w:r>
+        <w:rPr>
+          <w:rFonts w:ascii="Calibri" w:hAnsi="Calibri" w:eastAsia="等线"/>
+          <w:b/>
+          <w:sz w:val="19"/>
+        </w:rPr>
+        <w:t>/api/scenario</w:t>
+      </w:r>
+      <w:r>
+        <w:rPr>
+          <w:rFonts w:ascii="Calibri" w:hAnsi="Calibri" w:eastAsia="宋体"/>
+          <w:b w:val="0"/>
+          <w:sz w:val="21"/>
+        </w:rPr>
+        <w:t xml:space="preserve"> 提供可核验的数据连接。完整操作、字段含义和故障排查见 </w:t>
       </w:r>
       <w:r>
         <w:rPr>
@@ -4685,7 +4733,7 @@
           <w:p>
             <w:pPr>
               <w:keepNext/>
-              <w:spacing w:after="40" w:line="252" w:lineRule="auto"/>
+              <w:spacing w:after="0" w:line="240" w:lineRule="auto"/>
               <w:jc w:val="center"/>
             </w:pPr>
             <w:r/>
@@ -4694,7 +4742,7 @@
                 <w:rFonts w:ascii="Calibri" w:hAnsi="Calibri" w:eastAsia="微软雅黑"/>
                 <w:b/>
                 <w:color w:val="163A5F"/>
-                <w:sz w:val="18"/>
+                <w:sz w:val="17"/>
               </w:rPr>
               <w:t>要求</w:t>
             </w:r>
@@ -4715,7 +4763,7 @@
           <w:p>
             <w:pPr>
               <w:keepNext/>
-              <w:spacing w:after="40" w:line="252" w:lineRule="auto"/>
+              <w:spacing w:after="0" w:line="240" w:lineRule="auto"/>
               <w:jc w:val="center"/>
             </w:pPr>
             <w:r/>
@@ -4724,7 +4772,7 @@
                 <w:rFonts w:ascii="Calibri" w:hAnsi="Calibri" w:eastAsia="微软雅黑"/>
                 <w:b/>
                 <w:color w:val="163A5F"/>
-                <w:sz w:val="18"/>
+                <w:sz w:val="17"/>
               </w:rPr>
               <w:t>实现证据</w:t>
             </w:r>
@@ -4745,7 +4793,7 @@
           <w:p>
             <w:pPr>
               <w:keepNext/>
-              <w:spacing w:after="40" w:line="252" w:lineRule="auto"/>
+              <w:spacing w:after="0" w:line="240" w:lineRule="auto"/>
               <w:jc w:val="center"/>
             </w:pPr>
             <w:r/>
@@ -4754,7 +4802,7 @@
                 <w:rFonts w:ascii="Calibri" w:hAnsi="Calibri" w:eastAsia="微软雅黑"/>
                 <w:b/>
                 <w:color w:val="163A5F"/>
-                <w:sz w:val="18"/>
+                <w:sz w:val="17"/>
               </w:rPr>
               <w:t>状态</w:t>
             </w:r>
@@ -4778,7 +4826,7 @@
           </w:tcPr>
           <w:p>
             <w:pPr>
-              <w:spacing w:after="40" w:line="252" w:lineRule="auto"/>
+              <w:spacing w:after="0" w:line="240" w:lineRule="auto"/>
               <w:jc w:val="left"/>
             </w:pPr>
             <w:r/>
@@ -4786,7 +4834,7 @@
               <w:rPr>
                 <w:rFonts w:ascii="Calibri" w:hAnsi="Calibri" w:eastAsia="宋体"/>
                 <w:b w:val="0"/>
-                <w:sz w:val="18"/>
+                <w:sz w:val="17"/>
               </w:rPr>
               <w:t>5K～10K 反思数据</w:t>
             </w:r>
@@ -4805,7 +4853,7 @@
           </w:tcPr>
           <w:p>
             <w:pPr>
-              <w:spacing w:after="40" w:line="252" w:lineRule="auto"/>
+              <w:spacing w:after="0" w:line="240" w:lineRule="auto"/>
               <w:jc w:val="left"/>
             </w:pPr>
             <w:r/>
@@ -4813,7 +4861,7 @@
               <w:rPr>
                 <w:rFonts w:ascii="Calibri" w:hAnsi="Calibri" w:eastAsia="宋体"/>
                 <w:b w:val="0"/>
-                <w:sz w:val="18"/>
+                <w:sz w:val="17"/>
               </w:rPr>
               <w:t>data/reflection_dataset.jsonl，实际 5,000 条</w:t>
             </w:r>
@@ -4832,7 +4880,7 @@
           </w:tcPr>
           <w:p>
             <w:pPr>
-              <w:spacing w:after="40" w:line="252" w:lineRule="auto"/>
+              <w:spacing w:after="0" w:line="240" w:lineRule="auto"/>
               <w:jc w:val="center"/>
             </w:pPr>
             <w:r/>
@@ -4840,7 +4888,7 @@
               <w:rPr>
                 <w:rFonts w:ascii="Calibri" w:hAnsi="Calibri" w:eastAsia="宋体"/>
                 <w:b w:val="0"/>
-                <w:sz w:val="18"/>
+                <w:sz w:val="17"/>
               </w:rPr>
               <w:t>完成</w:t>
             </w:r>
@@ -4864,7 +4912,7 @@
           </w:tcPr>
           <w:p>
             <w:pPr>
-              <w:spacing w:after="40" w:line="252" w:lineRule="auto"/>
+              <w:spacing w:after="0" w:line="240" w:lineRule="auto"/>
               <w:jc w:val="left"/>
             </w:pPr>
             <w:r/>
@@ -4872,7 +4920,7 @@
               <w:rPr>
                 <w:rFonts w:ascii="Calibri" w:hAnsi="Calibri" w:eastAsia="宋体"/>
                 <w:b w:val="0"/>
-                <w:sz w:val="18"/>
+                <w:sz w:val="17"/>
               </w:rPr>
               <w:t>自动生成与质量过滤</w:t>
             </w:r>
@@ -4891,7 +4939,7 @@
           </w:tcPr>
           <w:p>
             <w:pPr>
-              <w:spacing w:after="40" w:line="252" w:lineRule="auto"/>
+              <w:spacing w:after="0" w:line="240" w:lineRule="auto"/>
               <w:jc w:val="left"/>
             </w:pPr>
             <w:r/>
@@ -4899,7 +4947,7 @@
               <w:rPr>
                 <w:rFonts w:ascii="Calibri" w:hAnsi="Calibri" w:eastAsia="宋体"/>
                 <w:b w:val="0"/>
-                <w:sz w:val="18"/>
+                <w:sz w:val="17"/>
               </w:rPr>
               <w:t>pipeline.py、质量阈值与 accepted 字段</w:t>
             </w:r>
@@ -4918,7 +4966,7 @@
           </w:tcPr>
           <w:p>
             <w:pPr>
-              <w:spacing w:after="40" w:line="252" w:lineRule="auto"/>
+              <w:spacing w:after="0" w:line="240" w:lineRule="auto"/>
               <w:jc w:val="center"/>
             </w:pPr>
             <w:r/>
@@ -4926,7 +4974,7 @@
               <w:rPr>
                 <w:rFonts w:ascii="Calibri" w:hAnsi="Calibri" w:eastAsia="宋体"/>
                 <w:b w:val="0"/>
-                <w:sz w:val="18"/>
+                <w:sz w:val="17"/>
               </w:rPr>
               <w:t>完成</w:t>
             </w:r>
@@ -4950,7 +4998,7 @@
           </w:tcPr>
           <w:p>
             <w:pPr>
-              <w:spacing w:after="40" w:line="252" w:lineRule="auto"/>
+              <w:spacing w:after="0" w:line="240" w:lineRule="auto"/>
               <w:jc w:val="left"/>
             </w:pPr>
             <w:r/>
@@ -4958,7 +5006,7 @@
               <w:rPr>
                 <w:rFonts w:ascii="Calibri" w:hAnsi="Calibri" w:eastAsia="宋体"/>
                 <w:b w:val="0"/>
-                <w:sz w:val="18"/>
+                <w:sz w:val="17"/>
               </w:rPr>
               <w:t>Safety/Rule/Comfort</w:t>
             </w:r>
@@ -4977,7 +5025,7 @@
           </w:tcPr>
           <w:p>
             <w:pPr>
-              <w:spacing w:after="40" w:line="252" w:lineRule="auto"/>
+              <w:spacing w:after="0" w:line="240" w:lineRule="auto"/>
               <w:jc w:val="left"/>
             </w:pPr>
             <w:r/>
@@ -4985,7 +5033,7 @@
               <w:rPr>
                 <w:rFonts w:ascii="Calibri" w:hAnsi="Calibri" w:eastAsia="宋体"/>
                 <w:b w:val="0"/>
-                <w:sz w:val="18"/>
+                <w:sz w:val="17"/>
               </w:rPr>
               <w:t>critics.py 三维评分及证据</w:t>
             </w:r>
@@ -5004,7 +5052,7 @@
           </w:tcPr>
           <w:p>
             <w:pPr>
-              <w:spacing w:after="40" w:line="252" w:lineRule="auto"/>
+              <w:spacing w:after="0" w:line="240" w:lineRule="auto"/>
               <w:jc w:val="center"/>
             </w:pPr>
             <w:r/>
@@ -5012,7 +5060,7 @@
               <w:rPr>
                 <w:rFonts w:ascii="Calibri" w:hAnsi="Calibri" w:eastAsia="宋体"/>
                 <w:b w:val="0"/>
-                <w:sz w:val="18"/>
+                <w:sz w:val="17"/>
               </w:rPr>
               <w:t>完成</w:t>
             </w:r>
@@ -5036,7 +5084,7 @@
           </w:tcPr>
           <w:p>
             <w:pPr>
-              <w:spacing w:after="40" w:line="252" w:lineRule="auto"/>
+              <w:spacing w:after="0" w:line="240" w:lineRule="auto"/>
               <w:jc w:val="left"/>
             </w:pPr>
             <w:r/>
@@ -5044,7 +5092,7 @@
               <w:rPr>
                 <w:rFonts w:ascii="Calibri" w:hAnsi="Calibri" w:eastAsia="宋体"/>
                 <w:b w:val="0"/>
-                <w:sz w:val="18"/>
+                <w:sz w:val="17"/>
               </w:rPr>
               <w:t>Rule/LLM/Reward Model</w:t>
             </w:r>
@@ -5063,7 +5111,7 @@
           </w:tcPr>
           <w:p>
             <w:pPr>
-              <w:spacing w:after="40" w:line="252" w:lineRule="auto"/>
+              <w:spacing w:after="0" w:line="240" w:lineRule="auto"/>
               <w:jc w:val="left"/>
             </w:pPr>
             <w:r/>
@@ -5071,7 +5119,7 @@
               <w:rPr>
                 <w:rFonts w:ascii="Calibri" w:hAnsi="Calibri" w:eastAsia="宋体"/>
                 <w:b w:val="0"/>
-                <w:sz w:val="18"/>
+                <w:sz w:val="17"/>
               </w:rPr>
               <w:t>三类 Critic 与统计对比</w:t>
             </w:r>
@@ -5090,7 +5138,7 @@
           </w:tcPr>
           <w:p>
             <w:pPr>
-              <w:spacing w:after="40" w:line="252" w:lineRule="auto"/>
+              <w:spacing w:after="0" w:line="240" w:lineRule="auto"/>
               <w:jc w:val="center"/>
             </w:pPr>
             <w:r/>
@@ -5098,7 +5146,7 @@
               <w:rPr>
                 <w:rFonts w:ascii="Calibri" w:hAnsi="Calibri" w:eastAsia="宋体"/>
                 <w:b w:val="0"/>
-                <w:sz w:val="18"/>
+                <w:sz w:val="17"/>
               </w:rPr>
               <w:t>完成；LLM 默认离线代理</w:t>
             </w:r>
@@ -5122,7 +5170,7 @@
           </w:tcPr>
           <w:p>
             <w:pPr>
-              <w:spacing w:after="40" w:line="252" w:lineRule="auto"/>
+              <w:spacing w:after="0" w:line="240" w:lineRule="auto"/>
               <w:jc w:val="left"/>
             </w:pPr>
             <w:r/>
@@ -5130,7 +5178,7 @@
               <w:rPr>
                 <w:rFonts w:ascii="Calibri" w:hAnsi="Calibri" w:eastAsia="宋体"/>
                 <w:b w:val="0"/>
-                <w:sz w:val="18"/>
+                <w:sz w:val="17"/>
               </w:rPr>
               <w:t>Baseline/SFT/Reflection SFT</w:t>
             </w:r>
@@ -5149,7 +5197,7 @@
           </w:tcPr>
           <w:p>
             <w:pPr>
-              <w:spacing w:after="40" w:line="252" w:lineRule="auto"/>
+              <w:spacing w:after="0" w:line="240" w:lineRule="auto"/>
               <w:jc w:val="left"/>
             </w:pPr>
             <w:r/>
@@ -5157,7 +5205,7 @@
               <w:rPr>
                 <w:rFonts w:ascii="Calibri" w:hAnsi="Calibri" w:eastAsia="宋体"/>
                 <w:b w:val="0"/>
-                <w:sz w:val="18"/>
+                <w:sz w:val="17"/>
               </w:rPr>
               <w:t>三组模型及未见场景结果</w:t>
             </w:r>
@@ -5176,7 +5224,7 @@
           </w:tcPr>
           <w:p>
             <w:pPr>
-              <w:spacing w:after="40" w:line="252" w:lineRule="auto"/>
+              <w:spacing w:after="0" w:line="240" w:lineRule="auto"/>
               <w:jc w:val="center"/>
             </w:pPr>
             <w:r/>
@@ -5184,7 +5232,7 @@
               <w:rPr>
                 <w:rFonts w:ascii="Calibri" w:hAnsi="Calibri" w:eastAsia="宋体"/>
                 <w:b w:val="0"/>
-                <w:sz w:val="18"/>
+                <w:sz w:val="17"/>
               </w:rPr>
               <w:t>完成</w:t>
             </w:r>
@@ -5208,7 +5256,7 @@
           </w:tcPr>
           <w:p>
             <w:pPr>
-              <w:spacing w:after="40" w:line="252" w:lineRule="auto"/>
+              <w:spacing w:after="0" w:line="240" w:lineRule="auto"/>
               <w:jc w:val="left"/>
             </w:pPr>
             <w:r/>
@@ -5216,7 +5264,7 @@
               <w:rPr>
                 <w:rFonts w:ascii="Calibri" w:hAnsi="Calibri" w:eastAsia="宋体"/>
                 <w:b w:val="0"/>
-                <w:sz w:val="18"/>
+                <w:sz w:val="17"/>
               </w:rPr>
               <w:t>Reflection+DPO/GRPO</w:t>
             </w:r>
@@ -5235,7 +5283,7 @@
           </w:tcPr>
           <w:p>
             <w:pPr>
-              <w:spacing w:after="40" w:line="252" w:lineRule="auto"/>
+              <w:spacing w:after="0" w:line="240" w:lineRule="auto"/>
               <w:jc w:val="left"/>
             </w:pPr>
             <w:r/>
@@ -5243,7 +5291,7 @@
               <w:rPr>
                 <w:rFonts w:ascii="Calibri" w:hAnsi="Calibri" w:eastAsia="宋体"/>
                 <w:b w:val="0"/>
-                <w:sz w:val="18"/>
+                <w:sz w:val="17"/>
               </w:rPr>
               <w:t>DPO 轻量实现；GRPO 方案说明</w:t>
             </w:r>
@@ -5262,7 +5310,7 @@
           </w:tcPr>
           <w:p>
             <w:pPr>
-              <w:spacing w:after="40" w:line="252" w:lineRule="auto"/>
+              <w:spacing w:after="0" w:line="240" w:lineRule="auto"/>
               <w:jc w:val="center"/>
             </w:pPr>
             <w:r/>
@@ -5270,7 +5318,7 @@
               <w:rPr>
                 <w:rFonts w:ascii="Calibri" w:hAnsi="Calibri" w:eastAsia="宋体"/>
                 <w:b w:val="0"/>
-                <w:sz w:val="18"/>
+                <w:sz w:val="17"/>
               </w:rPr>
               <w:t>DPO 完成，GRPO 为扩展</w:t>
             </w:r>
@@ -5294,7 +5342,7 @@
           </w:tcPr>
           <w:p>
             <w:pPr>
-              <w:spacing w:after="40" w:line="252" w:lineRule="auto"/>
+              <w:spacing w:after="0" w:line="240" w:lineRule="auto"/>
               <w:jc w:val="left"/>
             </w:pPr>
             <w:r/>
@@ -5302,7 +5350,7 @@
               <w:rPr>
                 <w:rFonts w:ascii="Calibri" w:hAnsi="Calibri" w:eastAsia="宋体"/>
                 <w:b w:val="0"/>
-                <w:sz w:val="18"/>
+                <w:sz w:val="17"/>
               </w:rPr>
               <w:t>碰撞/违章/舒适评估</w:t>
             </w:r>
@@ -5321,7 +5369,7 @@
           </w:tcPr>
           <w:p>
             <w:pPr>
-              <w:spacing w:after="40" w:line="252" w:lineRule="auto"/>
+              <w:spacing w:after="0" w:line="240" w:lineRule="auto"/>
               <w:jc w:val="left"/>
             </w:pPr>
             <w:r/>
@@ -5329,7 +5377,7 @@
               <w:rPr>
                 <w:rFonts w:ascii="Calibri" w:hAnsi="Calibri" w:eastAsia="宋体"/>
                 <w:b w:val="0"/>
-                <w:sz w:val="18"/>
+                <w:sz w:val="17"/>
               </w:rPr>
               <w:t>outputs/metrics.json</w:t>
             </w:r>
@@ -5348,7 +5396,7 @@
           </w:tcPr>
           <w:p>
             <w:pPr>
-              <w:spacing w:after="40" w:line="252" w:lineRule="auto"/>
+              <w:spacing w:after="0" w:line="240" w:lineRule="auto"/>
               <w:jc w:val="center"/>
             </w:pPr>
             <w:r/>
@@ -5356,7 +5404,7 @@
               <w:rPr>
                 <w:rFonts w:ascii="Calibri" w:hAnsi="Calibri" w:eastAsia="宋体"/>
                 <w:b w:val="0"/>
-                <w:sz w:val="18"/>
+                <w:sz w:val="17"/>
               </w:rPr>
               <w:t>完成（合成代理）</w:t>
             </w:r>
@@ -5380,7 +5428,7 @@
           </w:tcPr>
           <w:p>
             <w:pPr>
-              <w:spacing w:after="40" w:line="252" w:lineRule="auto"/>
+              <w:spacing w:after="0" w:line="240" w:lineRule="auto"/>
               <w:jc w:val="left"/>
             </w:pPr>
             <w:r/>
@@ -5388,7 +5436,7 @@
               <w:rPr>
                 <w:rFonts w:ascii="Calibri" w:hAnsi="Calibri" w:eastAsia="宋体"/>
                 <w:b w:val="0"/>
-                <w:sz w:val="18"/>
+                <w:sz w:val="17"/>
               </w:rPr>
               <w:t>失败原因定位</w:t>
             </w:r>
@@ -5407,7 +5455,7 @@
           </w:tcPr>
           <w:p>
             <w:pPr>
-              <w:spacing w:after="40" w:line="252" w:lineRule="auto"/>
+              <w:spacing w:after="0" w:line="240" w:lineRule="auto"/>
               <w:jc w:val="left"/>
             </w:pPr>
             <w:r/>
@@ -5415,7 +5463,7 @@
               <w:rPr>
                 <w:rFonts w:ascii="Calibri" w:hAnsi="Calibri" w:eastAsia="宋体"/>
                 <w:b w:val="0"/>
-                <w:sz w:val="18"/>
+                <w:sz w:val="17"/>
               </w:rPr>
               <w:t>五类 failure 标签与 evidence</w:t>
             </w:r>
@@ -5434,7 +5482,7 @@
           </w:tcPr>
           <w:p>
             <w:pPr>
-              <w:spacing w:after="40" w:line="252" w:lineRule="auto"/>
+              <w:spacing w:after="0" w:line="240" w:lineRule="auto"/>
               <w:jc w:val="center"/>
             </w:pPr>
             <w:r/>
@@ -5442,7 +5490,7 @@
               <w:rPr>
                 <w:rFonts w:ascii="Calibri" w:hAnsi="Calibri" w:eastAsia="宋体"/>
                 <w:b w:val="0"/>
-                <w:sz w:val="18"/>
+                <w:sz w:val="17"/>
               </w:rPr>
               <w:t>完成</w:t>
             </w:r>
@@ -5466,7 +5514,7 @@
           </w:tcPr>
           <w:p>
             <w:pPr>
-              <w:spacing w:after="40" w:line="252" w:lineRule="auto"/>
+              <w:spacing w:after="0" w:line="240" w:lineRule="auto"/>
               <w:jc w:val="left"/>
             </w:pPr>
             <w:r/>
@@ -5474,7 +5522,7 @@
               <w:rPr>
                 <w:rFonts w:ascii="Calibri" w:hAnsi="Calibri" w:eastAsia="宋体"/>
                 <w:b w:val="0"/>
-                <w:sz w:val="18"/>
+                <w:sz w:val="17"/>
               </w:rPr>
               <w:t>泛化能力</w:t>
             </w:r>
@@ -5493,7 +5541,7 @@
           </w:tcPr>
           <w:p>
             <w:pPr>
-              <w:spacing w:after="40" w:line="252" w:lineRule="auto"/>
+              <w:spacing w:after="0" w:line="240" w:lineRule="auto"/>
               <w:jc w:val="left"/>
             </w:pPr>
             <w:r/>
@@ -5501,7 +5549,7 @@
               <w:rPr>
                 <w:rFonts w:ascii="Calibri" w:hAnsi="Calibri" w:eastAsia="宋体"/>
                 <w:b w:val="0"/>
-                <w:sz w:val="18"/>
+                <w:sz w:val="17"/>
               </w:rPr>
               <w:t>1,000 条含夜间/高曲率未见场景</w:t>
             </w:r>
@@ -5520,7 +5568,7 @@
           </w:tcPr>
           <w:p>
             <w:pPr>
-              <w:spacing w:after="40" w:line="252" w:lineRule="auto"/>
+              <w:spacing w:after="0" w:line="240" w:lineRule="auto"/>
               <w:jc w:val="center"/>
             </w:pPr>
             <w:r/>
@@ -5528,7 +5576,7 @@
               <w:rPr>
                 <w:rFonts w:ascii="Calibri" w:hAnsi="Calibri" w:eastAsia="宋体"/>
                 <w:b w:val="0"/>
-                <w:sz w:val="18"/>
+                <w:sz w:val="17"/>
               </w:rPr>
               <w:t>完成（结构化代理）</w:t>
             </w:r>
@@ -5552,7 +5600,7 @@
           </w:tcPr>
           <w:p>
             <w:pPr>
-              <w:spacing w:after="40" w:line="252" w:lineRule="auto"/>
+              <w:spacing w:after="0" w:line="240" w:lineRule="auto"/>
               <w:jc w:val="left"/>
             </w:pPr>
             <w:r/>
@@ -5560,7 +5608,7 @@
               <w:rPr>
                 <w:rFonts w:ascii="Calibri" w:hAnsi="Calibri" w:eastAsia="宋体"/>
                 <w:b w:val="0"/>
-                <w:sz w:val="18"/>
+                <w:sz w:val="17"/>
               </w:rPr>
               <w:t>全套脚本和配置</w:t>
             </w:r>
@@ -5579,7 +5627,7 @@
           </w:tcPr>
           <w:p>
             <w:pPr>
-              <w:spacing w:after="40" w:line="252" w:lineRule="auto"/>
+              <w:spacing w:after="0" w:line="240" w:lineRule="auto"/>
               <w:jc w:val="left"/>
             </w:pPr>
             <w:r/>
@@ -5587,7 +5635,7 @@
               <w:rPr>
                 <w:rFonts w:ascii="Calibri" w:hAnsi="Calibri" w:eastAsia="宋体"/>
                 <w:b w:val="0"/>
-                <w:sz w:val="18"/>
+                <w:sz w:val="17"/>
               </w:rPr>
               <w:t>scripts/、configs/default.json</w:t>
             </w:r>
@@ -5606,7 +5654,7 @@
           </w:tcPr>
           <w:p>
             <w:pPr>
-              <w:spacing w:after="40" w:line="252" w:lineRule="auto"/>
+              <w:spacing w:after="0" w:line="240" w:lineRule="auto"/>
               <w:jc w:val="center"/>
             </w:pPr>
             <w:r/>
@@ -5614,7 +5662,7 @@
               <w:rPr>
                 <w:rFonts w:ascii="Calibri" w:hAnsi="Calibri" w:eastAsia="宋体"/>
                 <w:b w:val="0"/>
-                <w:sz w:val="18"/>
+                <w:sz w:val="17"/>
               </w:rPr>
               <w:t>完成</w:t>
             </w:r>
@@ -5638,7 +5686,7 @@
           </w:tcPr>
           <w:p>
             <w:pPr>
-              <w:spacing w:after="40" w:line="252" w:lineRule="auto"/>
+              <w:spacing w:after="0" w:line="240" w:lineRule="auto"/>
               <w:jc w:val="left"/>
             </w:pPr>
             <w:r/>
@@ -5646,7 +5694,7 @@
               <w:rPr>
                 <w:rFonts w:ascii="Calibri" w:hAnsi="Calibri" w:eastAsia="宋体"/>
                 <w:b w:val="0"/>
-                <w:sz w:val="18"/>
+                <w:sz w:val="17"/>
               </w:rPr>
               <w:t>一键复现</w:t>
             </w:r>
@@ -5665,7 +5713,7 @@
           </w:tcPr>
           <w:p>
             <w:pPr>
-              <w:spacing w:after="40" w:line="252" w:lineRule="auto"/>
+              <w:spacing w:after="0" w:line="240" w:lineRule="auto"/>
               <w:jc w:val="left"/>
             </w:pPr>
             <w:r/>
@@ -5673,7 +5721,7 @@
               <w:rPr>
                 <w:rFonts w:ascii="Calibri" w:hAnsi="Calibri" w:eastAsia="宋体"/>
                 <w:b w:val="0"/>
-                <w:sz w:val="18"/>
+                <w:sz w:val="17"/>
               </w:rPr>
               <w:t>scripts/run_all.py</w:t>
             </w:r>
@@ -5692,7 +5740,7 @@
           </w:tcPr>
           <w:p>
             <w:pPr>
-              <w:spacing w:after="40" w:line="252" w:lineRule="auto"/>
+              <w:spacing w:after="0" w:line="240" w:lineRule="auto"/>
               <w:jc w:val="center"/>
             </w:pPr>
             <w:r/>
@@ -5700,7 +5748,7 @@
               <w:rPr>
                 <w:rFonts w:ascii="Calibri" w:hAnsi="Calibri" w:eastAsia="宋体"/>
                 <w:b w:val="0"/>
-                <w:sz w:val="18"/>
+                <w:sz w:val="17"/>
               </w:rPr>
               <w:t>完成</w:t>
             </w:r>
@@ -5724,7 +5772,7 @@
           </w:tcPr>
           <w:p>
             <w:pPr>
-              <w:spacing w:after="40" w:line="252" w:lineRule="auto"/>
+              <w:spacing w:after="0" w:line="240" w:lineRule="auto"/>
               <w:jc w:val="left"/>
             </w:pPr>
             <w:r/>
@@ -5732,7 +5780,7 @@
               <w:rPr>
                 <w:rFonts w:ascii="Calibri" w:hAnsi="Calibri" w:eastAsia="宋体"/>
                 <w:b w:val="0"/>
-                <w:sz w:val="18"/>
+                <w:sz w:val="17"/>
               </w:rPr>
               <w:t>现场 Demo</w:t>
             </w:r>
@@ -5751,7 +5799,7 @@
           </w:tcPr>
           <w:p>
             <w:pPr>
-              <w:spacing w:after="40" w:line="252" w:lineRule="auto"/>
+              <w:spacing w:after="0" w:line="240" w:lineRule="auto"/>
               <w:jc w:val="left"/>
             </w:pPr>
             <w:r/>
@@ -5759,7 +5807,7 @@
               <w:rPr>
                 <w:rFonts w:ascii="Calibri" w:hAnsi="Calibri" w:eastAsia="宋体"/>
                 <w:b w:val="0"/>
-                <w:sz w:val="18"/>
+                <w:sz w:val="17"/>
               </w:rPr>
               <w:t>scripts/run_demo.py + 网页</w:t>
             </w:r>
@@ -5778,7 +5826,7 @@
           </w:tcPr>
           <w:p>
             <w:pPr>
-              <w:spacing w:after="40" w:line="252" w:lineRule="auto"/>
+              <w:spacing w:after="0" w:line="240" w:lineRule="auto"/>
               <w:jc w:val="center"/>
             </w:pPr>
             <w:r/>
@@ -5786,7 +5834,7 @@
               <w:rPr>
                 <w:rFonts w:ascii="Calibri" w:hAnsi="Calibri" w:eastAsia="宋体"/>
                 <w:b w:val="0"/>
-                <w:sz w:val="18"/>
+                <w:sz w:val="17"/>
               </w:rPr>
               <w:t>完成</w:t>
             </w:r>
@@ -5810,7 +5858,7 @@
           </w:tcPr>
           <w:p>
             <w:pPr>
-              <w:spacing w:after="40" w:line="252" w:lineRule="auto"/>
+              <w:spacing w:after="0" w:line="240" w:lineRule="auto"/>
               <w:jc w:val="left"/>
             </w:pPr>
             <w:r/>
@@ -5818,7 +5866,7 @@
               <w:rPr>
                 <w:rFonts w:ascii="Calibri" w:hAnsi="Calibri" w:eastAsia="宋体"/>
                 <w:b w:val="0"/>
-                <w:sz w:val="18"/>
+                <w:sz w:val="17"/>
               </w:rPr>
               <w:t>真实场景可视化</w:t>
             </w:r>
@@ -5837,7 +5885,7 @@
           </w:tcPr>
           <w:p>
             <w:pPr>
-              <w:spacing w:after="40" w:line="252" w:lineRule="auto"/>
+              <w:spacing w:after="0" w:line="240" w:lineRule="auto"/>
               <w:jc w:val="left"/>
             </w:pPr>
             <w:r/>
@@ -5845,7 +5893,7 @@
               <w:rPr>
                 <w:rFonts w:ascii="Calibri" w:hAnsi="Calibri" w:eastAsia="宋体"/>
                 <w:b w:val="0"/>
-                <w:sz w:val="18"/>
+                <w:sz w:val="17"/>
               </w:rPr>
               <w:t>双策略动态轨迹、信号灯/行人/前车、反思时间线</w:t>
             </w:r>
@@ -5864,7 +5912,7 @@
           </w:tcPr>
           <w:p>
             <w:pPr>
-              <w:spacing w:after="40" w:line="252" w:lineRule="auto"/>
+              <w:spacing w:after="0" w:line="240" w:lineRule="auto"/>
               <w:jc w:val="center"/>
             </w:pPr>
             <w:r/>
@@ -5872,7 +5920,7 @@
               <w:rPr>
                 <w:rFonts w:ascii="Calibri" w:hAnsi="Calibri" w:eastAsia="宋体"/>
                 <w:b w:val="0"/>
-                <w:sz w:val="18"/>
+                <w:sz w:val="17"/>
               </w:rPr>
               <w:t>完成（开放环模拟）</w:t>
             </w:r>
@@ -5896,7 +5944,7 @@
           </w:tcPr>
           <w:p>
             <w:pPr>
-              <w:spacing w:after="40" w:line="252" w:lineRule="auto"/>
+              <w:spacing w:after="0" w:line="240" w:lineRule="auto"/>
               <w:jc w:val="left"/>
             </w:pPr>
             <w:r/>
@@ -5904,7 +5952,7 @@
               <w:rPr>
                 <w:rFonts w:ascii="Calibri" w:hAnsi="Calibri" w:eastAsia="宋体"/>
                 <w:b w:val="0"/>
-                <w:sz w:val="18"/>
+                <w:sz w:val="17"/>
               </w:rPr>
               <w:t>必要基座</w:t>
             </w:r>
@@ -5923,7 +5971,7 @@
           </w:tcPr>
           <w:p>
             <w:pPr>
-              <w:spacing w:after="40" w:line="252" w:lineRule="auto"/>
+              <w:spacing w:after="0" w:line="240" w:lineRule="auto"/>
               <w:jc w:val="left"/>
             </w:pPr>
             <w:r/>
@@ -5931,7 +5979,7 @@
               <w:rPr>
                 <w:rFonts w:ascii="Calibri" w:hAnsi="Calibri" w:eastAsia="宋体"/>
                 <w:b w:val="0"/>
-                <w:sz w:val="18"/>
+                <w:sz w:val="17"/>
               </w:rPr>
               <w:t>OpenDriveVLA-0.5B checkpoint 与官方代码已下载并通过结构审计</w:t>
             </w:r>
@@ -5950,7 +5998,7 @@
           </w:tcPr>
           <w:p>
             <w:pPr>
-              <w:spacing w:after="40" w:line="252" w:lineRule="auto"/>
+              <w:spacing w:after="0" w:line="240" w:lineRule="auto"/>
               <w:jc w:val="center"/>
             </w:pPr>
             <w:r/>
@@ -5958,7 +6006,7 @@
               <w:rPr>
                 <w:rFonts w:ascii="Calibri" w:hAnsi="Calibri" w:eastAsia="宋体"/>
                 <w:b w:val="0"/>
-                <w:sz w:val="18"/>
+                <w:sz w:val="17"/>
               </w:rPr>
               <w:t>完成（冻结基座资产）</w:t>
             </w:r>
@@ -5982,7 +6030,7 @@
           </w:tcPr>
           <w:p>
             <w:pPr>
-              <w:spacing w:after="40" w:line="252" w:lineRule="auto"/>
+              <w:spacing w:after="0" w:line="240" w:lineRule="auto"/>
               <w:jc w:val="left"/>
             </w:pPr>
             <w:r/>
@@ -5990,7 +6038,7 @@
               <w:rPr>
                 <w:rFonts w:ascii="Calibri" w:hAnsi="Calibri" w:eastAsia="宋体"/>
                 <w:b w:val="0"/>
-                <w:sz w:val="18"/>
+                <w:sz w:val="17"/>
               </w:rPr>
               <w:t>多轮自进化</w:t>
             </w:r>
@@ -6009,7 +6057,7 @@
           </w:tcPr>
           <w:p>
             <w:pPr>
-              <w:spacing w:after="40" w:line="252" w:lineRule="auto"/>
+              <w:spacing w:after="0" w:line="240" w:lineRule="auto"/>
               <w:jc w:val="left"/>
             </w:pPr>
             <w:r/>
@@ -6017,7 +6065,7 @@
               <w:rPr>
                 <w:rFonts w:ascii="Calibri" w:hAnsi="Calibri" w:eastAsia="宋体"/>
                 <w:b w:val="0"/>
-                <w:sz w:val="18"/>
+                <w:sz w:val="17"/>
               </w:rPr>
               <w:t>三轮 rollout→Critic→Reflection→记忆回放；835 条经验记忆</w:t>
             </w:r>
@@ -6036,7 +6084,7 @@
           </w:tcPr>
           <w:p>
             <w:pPr>
-              <w:spacing w:after="40" w:line="252" w:lineRule="auto"/>
+              <w:spacing w:after="0" w:line="240" w:lineRule="auto"/>
               <w:jc w:val="center"/>
             </w:pPr>
             <w:r/>
@@ -6044,7 +6092,7 @@
               <w:rPr>
                 <w:rFonts w:ascii="Calibri" w:hAnsi="Calibri" w:eastAsia="宋体"/>
                 <w:b w:val="0"/>
-                <w:sz w:val="18"/>
+                <w:sz w:val="17"/>
               </w:rPr>
               <w:t>完成（轻量实验）</w:t>
             </w:r>
@@ -6068,7 +6116,7 @@
           </w:tcPr>
           <w:p>
             <w:pPr>
-              <w:spacing w:after="40" w:line="252" w:lineRule="auto"/>
+              <w:spacing w:after="0" w:line="240" w:lineRule="auto"/>
               <w:jc w:val="left"/>
             </w:pPr>
             <w:r/>
@@ -6076,7 +6124,7 @@
               <w:rPr>
                 <w:rFonts w:ascii="Calibri" w:hAnsi="Calibri" w:eastAsia="宋体"/>
                 <w:b w:val="0"/>
-                <w:sz w:val="18"/>
+                <w:sz w:val="17"/>
               </w:rPr>
               <w:t>OpenDriveVLA 训练数据</w:t>
             </w:r>
@@ -6095,7 +6143,7 @@
           </w:tcPr>
           <w:p>
             <w:pPr>
-              <w:spacing w:after="40" w:line="252" w:lineRule="auto"/>
+              <w:spacing w:after="0" w:line="240" w:lineRule="auto"/>
               <w:jc w:val="left"/>
             </w:pPr>
             <w:r/>
@@ -6103,7 +6151,7 @@
               <w:rPr>
                 <w:rFonts w:ascii="Calibri" w:hAnsi="Calibri" w:eastAsia="宋体"/>
                 <w:b w:val="0"/>
-                <w:sz w:val="18"/>
+                <w:sz w:val="17"/>
               </w:rPr>
               <w:t>SFT 1813、Reflection SFT 1813、DPO 1112 对</w:t>
             </w:r>
@@ -6122,7 +6170,7 @@
           </w:tcPr>
           <w:p>
             <w:pPr>
-              <w:spacing w:after="40" w:line="252" w:lineRule="auto"/>
+              <w:spacing w:after="0" w:line="240" w:lineRule="auto"/>
               <w:jc w:val="center"/>
             </w:pPr>
             <w:r/>
@@ -6130,7 +6178,7 @@
               <w:rPr>
                 <w:rFonts w:ascii="Calibri" w:hAnsi="Calibri" w:eastAsia="宋体"/>
                 <w:b w:val="0"/>
-                <w:sz w:val="18"/>
+                <w:sz w:val="17"/>
               </w:rPr>
               <w:t>完成（轻量数据）</w:t>
             </w:r>
@@ -6154,7 +6202,7 @@
           </w:tcPr>
           <w:p>
             <w:pPr>
-              <w:spacing w:after="40" w:line="252" w:lineRule="auto"/>
+              <w:spacing w:after="0" w:line="240" w:lineRule="auto"/>
               <w:jc w:val="left"/>
             </w:pPr>
             <w:r/>
@@ -6162,7 +6210,7 @@
               <w:rPr>
                 <w:rFonts w:ascii="Calibri" w:hAnsi="Calibri" w:eastAsia="宋体"/>
                 <w:b w:val="0"/>
-                <w:sz w:val="18"/>
+                <w:sz w:val="17"/>
               </w:rPr>
               <w:t>LoRA/PEFT 训练代码</w:t>
             </w:r>
@@ -6181,7 +6229,7 @@
           </w:tcPr>
           <w:p>
             <w:pPr>
-              <w:spacing w:after="40" w:line="252" w:lineRule="auto"/>
+              <w:spacing w:after="0" w:line="240" w:lineRule="auto"/>
               <w:jc w:val="left"/>
             </w:pPr>
             <w:r/>
@@ -6189,7 +6237,7 @@
               <w:rPr>
                 <w:rFonts w:ascii="Calibri" w:hAnsi="Calibri" w:eastAsia="宋体"/>
                 <w:b w:val="0"/>
-                <w:sz w:val="18"/>
+                <w:sz w:val="17"/>
               </w:rPr>
               <w:t>train_opendrivevla_peft.py 与配置；Windows 可 check-only</w:t>
             </w:r>
@@ -6208,7 +6256,7 @@
           </w:tcPr>
           <w:p>
             <w:pPr>
-              <w:spacing w:after="40" w:line="252" w:lineRule="auto"/>
+              <w:spacing w:after="0" w:line="240" w:lineRule="auto"/>
               <w:jc w:val="center"/>
             </w:pPr>
             <w:r/>
@@ -6216,7 +6264,7 @@
               <w:rPr>
                 <w:rFonts w:ascii="Calibri" w:hAnsi="Calibri" w:eastAsia="宋体"/>
                 <w:b w:val="0"/>
-                <w:sz w:val="18"/>
+                <w:sz w:val="17"/>
               </w:rPr>
               <w:t>完成代码；GPU 执行为扩展</w:t>
             </w:r>
@@ -6240,7 +6288,7 @@
           </w:tcPr>
           <w:p>
             <w:pPr>
-              <w:spacing w:after="40" w:line="252" w:lineRule="auto"/>
+              <w:spacing w:after="0" w:line="240" w:lineRule="auto"/>
               <w:jc w:val="left"/>
             </w:pPr>
             <w:r/>
@@ -6248,7 +6296,7 @@
               <w:rPr>
                 <w:rFonts w:ascii="Calibri" w:hAnsi="Calibri" w:eastAsia="宋体"/>
                 <w:b w:val="0"/>
-                <w:sz w:val="18"/>
+                <w:sz w:val="17"/>
               </w:rPr>
               <w:t>使用文档</w:t>
             </w:r>
@@ -6267,7 +6315,7 @@
           </w:tcPr>
           <w:p>
             <w:pPr>
-              <w:spacing w:after="40" w:line="252" w:lineRule="auto"/>
+              <w:spacing w:after="0" w:line="240" w:lineRule="auto"/>
               <w:jc w:val="left"/>
             </w:pPr>
             <w:r/>
@@ -6275,7 +6323,7 @@
               <w:rPr>
                 <w:rFonts w:ascii="Calibri" w:hAnsi="Calibri" w:eastAsia="宋体"/>
                 <w:b w:val="0"/>
-                <w:sz w:val="18"/>
+                <w:sz w:val="17"/>
               </w:rPr>
               <w:t>docs/Demo使用说明.md、docs/基座模型与轻量化说明.md</w:t>
             </w:r>
@@ -6294,7 +6342,7 @@
           </w:tcPr>
           <w:p>
             <w:pPr>
-              <w:spacing w:after="40" w:line="252" w:lineRule="auto"/>
+              <w:spacing w:after="0" w:line="240" w:lineRule="auto"/>
               <w:jc w:val="center"/>
             </w:pPr>
             <w:r/>
@@ -6302,7 +6350,7 @@
               <w:rPr>
                 <w:rFonts w:ascii="Calibri" w:hAnsi="Calibri" w:eastAsia="宋体"/>
                 <w:b w:val="0"/>
-                <w:sz w:val="18"/>
+                <w:sz w:val="17"/>
               </w:rPr>
               <w:t>完成</w:t>
             </w:r>
@@ -6326,7 +6374,7 @@
           </w:tcPr>
           <w:p>
             <w:pPr>
-              <w:spacing w:after="40" w:line="252" w:lineRule="auto"/>
+              <w:spacing w:after="0" w:line="240" w:lineRule="auto"/>
               <w:jc w:val="left"/>
             </w:pPr>
             <w:r/>
@@ -6334,7 +6382,7 @@
               <w:rPr>
                 <w:rFonts w:ascii="Calibri" w:hAnsi="Calibri" w:eastAsia="宋体"/>
                 <w:b w:val="0"/>
-                <w:sz w:val="18"/>
+                <w:sz w:val="17"/>
               </w:rPr>
               <w:t>自动测试</w:t>
             </w:r>
@@ -6353,7 +6401,7 @@
           </w:tcPr>
           <w:p>
             <w:pPr>
-              <w:spacing w:after="40" w:line="252" w:lineRule="auto"/>
+              <w:spacing w:after="0" w:line="240" w:lineRule="auto"/>
               <w:jc w:val="left"/>
             </w:pPr>
             <w:r/>
@@ -6361,7 +6409,7 @@
               <w:rPr>
                 <w:rFonts w:ascii="Calibri" w:hAnsi="Calibri" w:eastAsia="宋体"/>
                 <w:b w:val="0"/>
-                <w:sz w:val="18"/>
+                <w:sz w:val="17"/>
               </w:rPr>
               <w:t>tests/test_core.py</w:t>
             </w:r>
@@ -6380,7 +6428,7 @@
           </w:tcPr>
           <w:p>
             <w:pPr>
-              <w:spacing w:after="40" w:line="252" w:lineRule="auto"/>
+              <w:spacing w:after="0" w:line="240" w:lineRule="auto"/>
               <w:jc w:val="center"/>
             </w:pPr>
             <w:r/>
@@ -6388,7 +6436,7 @@
               <w:rPr>
                 <w:rFonts w:ascii="Calibri" w:hAnsi="Calibri" w:eastAsia="宋体"/>
                 <w:b w:val="0"/>
-                <w:sz w:val="18"/>
+                <w:sz w:val="17"/>
               </w:rPr>
               <w:t>完成</w:t>
             </w:r>

</xml_diff>